<commit_message>
Update Knowledge Representation and Reasoning report
</commit_message>
<xml_diff>
--- a/week-4/Biểu diễn tri thức và Suy luận.docx
+++ b/week-4/Biểu diễn tri thức và Suy luận.docx
@@ -539,7 +539,7 @@
           <w:rFonts w:ascii="Times New Roman" w:hAnsi="Times New Roman" w:cs="Times New Roman"/>
           <w:noProof/>
         </w:rPr>
-        <w:pict w14:anchorId="5063C0D6">
+        <w:pict w14:anchorId="1A501E12">
           <v:rect id="_x0000_s2051" alt="" style="width:475.5pt;height:.05pt;mso-width-percent:0;mso-height-percent:0;mso-left-percent:-10001;mso-top-percent:-10001;mso-position-horizontal:absolute;mso-position-horizontal-relative:char;mso-position-vertical:absolute;mso-position-vertical-relative:line;mso-width-percent:0;mso-height-percent:0;mso-left-percent:-10001;mso-top-percent:-10001" o:hralign="center" o:hrstd="t" strokeweight="1pt">
             <v:stroke opacity="0"/>
           </v:rect>
@@ -610,7 +610,7 @@
           <w:rFonts w:ascii="Times New Roman" w:hAnsi="Times New Roman" w:cs="Times New Roman"/>
           <w:noProof/>
         </w:rPr>
-        <w:pict w14:anchorId="31CADA23">
+        <w:pict w14:anchorId="04FB1FD7">
           <v:rect id="_x0000_s2050" alt="" style="width:475.5pt;height:.05pt;mso-width-percent:0;mso-height-percent:0;mso-left-percent:-10001;mso-top-percent:-10001;mso-position-horizontal:absolute;mso-position-horizontal-relative:char;mso-position-vertical:absolute;mso-position-vertical-relative:line;mso-width-percent:0;mso-height-percent:0;mso-left-percent:-10001;mso-top-percent:-10001" o:hralign="center" o:hrstd="t" strokeweight="1pt">
             <v:stroke opacity="0"/>
           </v:rect>
@@ -1660,27 +1660,7 @@
                 <w:bCs/>
                 <w:noProof/>
               </w:rPr>
-              <w:t>PHẦN 3: CÁC THÁCH THỨC CỦA</w:t>
-            </w:r>
-            <w:r>
-              <w:rPr>
-                <w:rStyle w:val="Hyperlink"/>
-                <w:rFonts w:ascii="Times New Roman" w:hAnsi="Times New Roman" w:cs="Times New Roman"/>
-                <w:b/>
-                <w:bCs/>
-                <w:noProof/>
-              </w:rPr>
-              <w:t xml:space="preserve"> </w:t>
-            </w:r>
-            <w:r>
-              <w:rPr>
-                <w:rStyle w:val="Hyperlink"/>
-                <w:rFonts w:ascii="Times New Roman" w:hAnsi="Times New Roman" w:cs="Times New Roman"/>
-                <w:b/>
-                <w:bCs/>
-                <w:noProof/>
-              </w:rPr>
-              <w:t>KR DƯỚI DẠNG SƠ ĐỒ MINDMAP</w:t>
+              <w:t>PHẦN 3: CÁC THÁCH THỨC CỦA KR DƯỚI DẠNG SƠ ĐỒ MINDMAP</w:t>
             </w:r>
             <w:r>
               <w:rPr>
@@ -1832,7 +1812,7 @@
           <w:color w:val="auto"/>
           <w:sz w:val="28"/>
         </w:rPr>
-        <w:t xml:space="preserve">Logic </w:t>
+        <w:t xml:space="preserve">Các </w:t>
       </w:r>
       <w:r>
         <w:rPr>
@@ -3693,16 +3673,7 @@
           <w:sz w:val="22"/>
           <w:shd w:val="clear" w:color="auto" w:fill="FFFFFF"/>
         </w:rPr>
-        <w:t>H</w:t>
-      </w:r>
-      <w:r>
-        <w:rPr>
-          <w:rFonts w:asciiTheme="minorHAnsi"/>
-          <w:color w:val="303030"/>
-          <w:sz w:val="22"/>
-          <w:shd w:val="clear" w:color="auto" w:fill="FFFFFF"/>
-        </w:rPr>
-        <w:t>ệ thống robot ứng dụng KR có thể mở rộng theo các hướng then chốt sau</w:t>
+        <w:t>Hệ thống robot ứng dụng KR có thể mở rộng theo các hướng then chốt sau</w:t>
       </w:r>
     </w:p>
     <w:p>

</xml_diff>

<commit_message>
assignment 4: break page for knowledge representation and reasoning report
</commit_message>
<xml_diff>
--- a/week-4/Biểu diễn tri thức và Suy luận.docx
+++ b/week-4/Biểu diễn tri thức và Suy luận.docx
@@ -539,7 +539,7 @@
           <w:rFonts w:ascii="Times New Roman" w:hAnsi="Times New Roman" w:cs="Times New Roman"/>
           <w:noProof/>
         </w:rPr>
-        <w:pict w14:anchorId="1A501E12">
+        <w:pict w14:anchorId="6BDC225D">
           <v:rect id="_x0000_s2051" alt="" style="width:475.5pt;height:.05pt;mso-width-percent:0;mso-height-percent:0;mso-left-percent:-10001;mso-top-percent:-10001;mso-position-horizontal:absolute;mso-position-horizontal-relative:char;mso-position-vertical:absolute;mso-position-vertical-relative:line;mso-width-percent:0;mso-height-percent:0;mso-left-percent:-10001;mso-top-percent:-10001" o:hralign="center" o:hrstd="t" strokeweight="1pt">
             <v:stroke opacity="0"/>
           </v:rect>
@@ -577,7 +577,7 @@
           <w:rFonts w:ascii="Times New Roman" w:hAnsi="Times New Roman" w:cs="Times New Roman"/>
         </w:rPr>
       </w:pPr>
-      <w:bookmarkStart w:id="1" w:name="_Toc238909019"/>
+      <w:bookmarkStart w:id="1" w:name="_Toc238910070"/>
       <w:r>
         <w:rPr>
           <w:rFonts w:ascii="Times New Roman" w:eastAsia="source serif 4" w:hAnsi="Times New Roman" w:cs="Times New Roman"/>
@@ -610,7 +610,7 @@
           <w:rFonts w:ascii="Times New Roman" w:hAnsi="Times New Roman" w:cs="Times New Roman"/>
           <w:noProof/>
         </w:rPr>
-        <w:pict w14:anchorId="04FB1FD7">
+        <w:pict w14:anchorId="6658675B">
           <v:rect id="_x0000_s2050" alt="" style="width:475.5pt;height:.05pt;mso-width-percent:0;mso-height-percent:0;mso-left-percent:-10001;mso-top-percent:-10001;mso-position-horizontal:absolute;mso-position-horizontal-relative:char;mso-position-vertical:absolute;mso-position-vertical-relative:line;mso-width-percent:0;mso-height-percent:0;mso-left-percent:-10001;mso-top-percent:-10001" o:hralign="center" o:hrstd="t" strokeweight="1pt">
             <v:stroke opacity="0"/>
           </v:rect>
@@ -671,7 +671,7 @@
           <w:r>
             <w:fldChar w:fldCharType="separate"/>
           </w:r>
-          <w:hyperlink w:anchor="_Toc238909019" w:history="1">
+          <w:hyperlink w:anchor="_Toc238910070" w:history="1">
             <w:r>
               <w:rPr>
                 <w:rStyle w:val="Hyperlink"/>
@@ -700,7 +700,7 @@
                 <w:noProof/>
                 <w:webHidden/>
               </w:rPr>
-              <w:instrText xml:space="preserve"> PAGEREF _Toc238909019 \h </w:instrText>
+              <w:instrText xml:space="preserve"> PAGEREF _Toc238910070 \h </w:instrText>
             </w:r>
             <w:r>
               <w:rPr>
@@ -747,7 +747,7 @@
               <w14:ligatures w14:val="standardContextual"/>
             </w:rPr>
           </w:pPr>
-          <w:hyperlink w:anchor="_Toc238909020" w:history="1">
+          <w:hyperlink w:anchor="_Toc238910071" w:history="1">
             <w:r>
               <w:rPr>
                 <w:rStyle w:val="Hyperlink"/>
@@ -777,7 +777,7 @@
                 <w:noProof/>
                 <w:webHidden/>
               </w:rPr>
-              <w:instrText xml:space="preserve"> PAGEREF _Toc238909020 \h </w:instrText>
+              <w:instrText xml:space="preserve"> PAGEREF _Toc238910071 \h </w:instrText>
             </w:r>
             <w:r>
               <w:rPr>
@@ -824,14 +824,14 @@
               <w14:ligatures w14:val="standardContextual"/>
             </w:rPr>
           </w:pPr>
-          <w:hyperlink w:anchor="_Toc238909021" w:history="1">
+          <w:hyperlink w:anchor="_Toc238910072" w:history="1">
             <w:r>
               <w:rPr>
                 <w:rStyle w:val="Hyperlink"/>
                 <w:rFonts w:ascii="Times New Roman" w:hAnsi="Times New Roman" w:cs="Times New Roman"/>
                 <w:noProof/>
               </w:rPr>
-              <w:t>1.1  Logic hệ hình Logic hình thức và Lập trình Logic (Formal Logics &amp; Logic Programming)</w:t>
+              <w:t>1.1  Các hệ hình Logic hình thức và Lập trình Logic (Formal Logics &amp; Logic Programming)</w:t>
             </w:r>
             <w:r>
               <w:rPr>
@@ -852,7 +852,7 @@
                 <w:noProof/>
                 <w:webHidden/>
               </w:rPr>
-              <w:instrText xml:space="preserve"> PAGEREF _Toc238909021 \h </w:instrText>
+              <w:instrText xml:space="preserve"> PAGEREF _Toc238910072 \h </w:instrText>
             </w:r>
             <w:r>
               <w:rPr>
@@ -899,7 +899,7 @@
               <w14:ligatures w14:val="standardContextual"/>
             </w:rPr>
           </w:pPr>
-          <w:hyperlink w:anchor="_Toc238909022" w:history="1">
+          <w:hyperlink w:anchor="_Toc238910073" w:history="1">
             <w:r>
               <w:rPr>
                 <w:rStyle w:val="Hyperlink"/>
@@ -927,7 +927,7 @@
                 <w:noProof/>
                 <w:webHidden/>
               </w:rPr>
-              <w:instrText xml:space="preserve"> PAGEREF _Toc238909022 \h </w:instrText>
+              <w:instrText xml:space="preserve"> PAGEREF _Toc238910073 \h </w:instrText>
             </w:r>
             <w:r>
               <w:rPr>
@@ -974,7 +974,7 @@
               <w14:ligatures w14:val="standardContextual"/>
             </w:rPr>
           </w:pPr>
-          <w:hyperlink w:anchor="_Toc238909023" w:history="1">
+          <w:hyperlink w:anchor="_Toc238910074" w:history="1">
             <w:r>
               <w:rPr>
                 <w:rStyle w:val="Hyperlink"/>
@@ -1002,7 +1002,7 @@
                 <w:noProof/>
                 <w:webHidden/>
               </w:rPr>
-              <w:instrText xml:space="preserve"> PAGEREF _Toc238909023 \h </w:instrText>
+              <w:instrText xml:space="preserve"> PAGEREF _Toc238910074 \h </w:instrText>
             </w:r>
             <w:r>
               <w:rPr>
@@ -1049,7 +1049,7 @@
               <w14:ligatures w14:val="standardContextual"/>
             </w:rPr>
           </w:pPr>
-          <w:hyperlink w:anchor="_Toc238909024" w:history="1">
+          <w:hyperlink w:anchor="_Toc238910075" w:history="1">
             <w:r>
               <w:rPr>
                 <w:rStyle w:val="Hyperlink"/>
@@ -1077,7 +1077,7 @@
                 <w:noProof/>
                 <w:webHidden/>
               </w:rPr>
-              <w:instrText xml:space="preserve"> PAGEREF _Toc238909024 \h </w:instrText>
+              <w:instrText xml:space="preserve"> PAGEREF _Toc238910075 \h </w:instrText>
             </w:r>
             <w:r>
               <w:rPr>
@@ -1124,7 +1124,7 @@
               <w14:ligatures w14:val="standardContextual"/>
             </w:rPr>
           </w:pPr>
-          <w:hyperlink w:anchor="_Toc238909025" w:history="1">
+          <w:hyperlink w:anchor="_Toc238910076" w:history="1">
             <w:r>
               <w:rPr>
                 <w:rStyle w:val="Hyperlink"/>
@@ -1152,7 +1152,7 @@
                 <w:noProof/>
                 <w:webHidden/>
               </w:rPr>
-              <w:instrText xml:space="preserve"> PAGEREF _Toc238909025 \h </w:instrText>
+              <w:instrText xml:space="preserve"> PAGEREF _Toc238910076 \h </w:instrText>
             </w:r>
             <w:r>
               <w:rPr>
@@ -1199,7 +1199,7 @@
               <w14:ligatures w14:val="standardContextual"/>
             </w:rPr>
           </w:pPr>
-          <w:hyperlink w:anchor="_Toc238909026" w:history="1">
+          <w:hyperlink w:anchor="_Toc238910077" w:history="1">
             <w:r>
               <w:rPr>
                 <w:rStyle w:val="Hyperlink"/>
@@ -1227,7 +1227,7 @@
                 <w:noProof/>
                 <w:webHidden/>
               </w:rPr>
-              <w:instrText xml:space="preserve"> PAGEREF _Toc238909026 \h </w:instrText>
+              <w:instrText xml:space="preserve"> PAGEREF _Toc238910077 \h </w:instrText>
             </w:r>
             <w:r>
               <w:rPr>
@@ -1274,7 +1274,7 @@
               <w14:ligatures w14:val="standardContextual"/>
             </w:rPr>
           </w:pPr>
-          <w:hyperlink w:anchor="_Toc238909027" w:history="1">
+          <w:hyperlink w:anchor="_Toc238910078" w:history="1">
             <w:r>
               <w:rPr>
                 <w:rStyle w:val="Hyperlink"/>
@@ -1302,7 +1302,7 @@
                 <w:noProof/>
                 <w:webHidden/>
               </w:rPr>
-              <w:instrText xml:space="preserve"> PAGEREF _Toc238909027 \h </w:instrText>
+              <w:instrText xml:space="preserve"> PAGEREF _Toc238910078 \h </w:instrText>
             </w:r>
             <w:r>
               <w:rPr>
@@ -1349,7 +1349,7 @@
               <w14:ligatures w14:val="standardContextual"/>
             </w:rPr>
           </w:pPr>
-          <w:hyperlink w:anchor="_Toc238909028" w:history="1">
+          <w:hyperlink w:anchor="_Toc238910079" w:history="1">
             <w:r>
               <w:rPr>
                 <w:rStyle w:val="Hyperlink"/>
@@ -1377,7 +1377,7 @@
                 <w:noProof/>
                 <w:webHidden/>
               </w:rPr>
-              <w:instrText xml:space="preserve"> PAGEREF _Toc238909028 \h </w:instrText>
+              <w:instrText xml:space="preserve"> PAGEREF _Toc238910079 \h </w:instrText>
             </w:r>
             <w:r>
               <w:rPr>
@@ -1424,7 +1424,7 @@
               <w14:ligatures w14:val="standardContextual"/>
             </w:rPr>
           </w:pPr>
-          <w:hyperlink w:anchor="_Toc238909029" w:history="1">
+          <w:hyperlink w:anchor="_Toc238910080" w:history="1">
             <w:r>
               <w:rPr>
                 <w:rStyle w:val="Hyperlink"/>
@@ -1454,7 +1454,7 @@
                 <w:noProof/>
                 <w:webHidden/>
               </w:rPr>
-              <w:instrText xml:space="preserve"> PAGEREF _Toc238909029 \h </w:instrText>
+              <w:instrText xml:space="preserve"> PAGEREF _Toc238910080 \h </w:instrText>
             </w:r>
             <w:r>
               <w:rPr>
@@ -1474,7 +1474,7 @@
                 <w:noProof/>
                 <w:webHidden/>
               </w:rPr>
-              <w:t>3</w:t>
+              <w:t>4</w:t>
             </w:r>
             <w:r>
               <w:rPr>
@@ -1501,7 +1501,7 @@
               <w14:ligatures w14:val="standardContextual"/>
             </w:rPr>
           </w:pPr>
-          <w:hyperlink w:anchor="_Toc238909030" w:history="1">
+          <w:hyperlink w:anchor="_Toc238910081" w:history="1">
             <w:r>
               <w:rPr>
                 <w:rStyle w:val="Hyperlink"/>
@@ -1529,7 +1529,7 @@
                 <w:noProof/>
                 <w:webHidden/>
               </w:rPr>
-              <w:instrText xml:space="preserve"> PAGEREF _Toc238909030 \h </w:instrText>
+              <w:instrText xml:space="preserve"> PAGEREF _Toc238910081 \h </w:instrText>
             </w:r>
             <w:r>
               <w:rPr>
@@ -1549,7 +1549,7 @@
                 <w:noProof/>
                 <w:webHidden/>
               </w:rPr>
-              <w:t>3</w:t>
+              <w:t>4</w:t>
             </w:r>
             <w:r>
               <w:rPr>
@@ -1576,7 +1576,7 @@
               <w14:ligatures w14:val="standardContextual"/>
             </w:rPr>
           </w:pPr>
-          <w:hyperlink w:anchor="_Toc238909031" w:history="1">
+          <w:hyperlink w:anchor="_Toc238910082" w:history="1">
             <w:r>
               <w:rPr>
                 <w:rStyle w:val="Hyperlink"/>
@@ -1604,7 +1604,7 @@
                 <w:noProof/>
                 <w:webHidden/>
               </w:rPr>
-              <w:instrText xml:space="preserve"> PAGEREF _Toc238909031 \h </w:instrText>
+              <w:instrText xml:space="preserve"> PAGEREF _Toc238910082 \h </w:instrText>
             </w:r>
             <w:r>
               <w:rPr>
@@ -1651,7 +1651,7 @@
               <w14:ligatures w14:val="standardContextual"/>
             </w:rPr>
           </w:pPr>
-          <w:hyperlink w:anchor="_Toc238909032" w:history="1">
+          <w:hyperlink w:anchor="_Toc238910083" w:history="1">
             <w:r>
               <w:rPr>
                 <w:rStyle w:val="Hyperlink"/>
@@ -1681,7 +1681,7 @@
                 <w:noProof/>
                 <w:webHidden/>
               </w:rPr>
-              <w:instrText xml:space="preserve"> PAGEREF _Toc238909032 \h </w:instrText>
+              <w:instrText xml:space="preserve"> PAGEREF _Toc238910083 \h </w:instrText>
             </w:r>
             <w:r>
               <w:rPr>
@@ -1701,7 +1701,7 @@
                 <w:noProof/>
                 <w:webHidden/>
               </w:rPr>
-              <w:t>4</w:t>
+              <w:t>5</w:t>
             </w:r>
             <w:r>
               <w:rPr>
@@ -1747,7 +1747,7 @@
         </w:rPr>
         <w:br w:type="page"/>
       </w:r>
-      <w:bookmarkStart w:id="3" w:name="_Toc238909020"/>
+      <w:bookmarkStart w:id="3" w:name="_Toc238910071"/>
       <w:r>
         <w:rPr>
           <w:rFonts w:ascii="Times New Roman" w:hAnsi="Times New Roman" w:cs="Times New Roman"/>
@@ -1781,7 +1781,7 @@
           <w:sz w:val="28"/>
         </w:rPr>
       </w:pPr>
-      <w:bookmarkStart w:id="4" w:name="_Toc238909021"/>
+      <w:bookmarkStart w:id="4" w:name="_Toc238910072"/>
       <w:r>
         <w:rPr>
           <w:rFonts w:ascii="Times New Roman" w:hAnsi="Times New Roman" w:cs="Times New Roman"/>
@@ -2046,7 +2046,7 @@
           <w:color w:val="auto"/>
         </w:rPr>
       </w:pPr>
-      <w:bookmarkStart w:id="5" w:name="_Toc238909022"/>
+      <w:bookmarkStart w:id="5" w:name="_Toc238910073"/>
       <w:r>
         <w:rPr>
           <w:rFonts w:ascii="Times New Roman" w:hAnsi="Times New Roman" w:cs="Times New Roman"/>
@@ -2208,7 +2208,7 @@
           <w:color w:val="auto"/>
         </w:rPr>
       </w:pPr>
-      <w:bookmarkStart w:id="6" w:name="_Toc238909023"/>
+      <w:bookmarkStart w:id="6" w:name="_Toc238910074"/>
       <w:r>
         <w:rPr>
           <w:rFonts w:ascii="Times New Roman" w:hAnsi="Times New Roman" w:cs="Times New Roman"/>
@@ -2288,7 +2288,7 @@
           <w:sz w:val="28"/>
         </w:rPr>
       </w:pPr>
-      <w:bookmarkStart w:id="7" w:name="_Toc238909024"/>
+      <w:bookmarkStart w:id="7" w:name="_Toc238910075"/>
       <w:r>
         <w:rPr>
           <w:rFonts w:ascii="Times New Roman" w:hAnsi="Times New Roman" w:cs="Times New Roman"/>
@@ -2426,7 +2426,7 @@
           <w:sz w:val="28"/>
         </w:rPr>
       </w:pPr>
-      <w:bookmarkStart w:id="8" w:name="_Toc238909025"/>
+      <w:bookmarkStart w:id="8" w:name="_Toc238910076"/>
       <w:r>
         <w:rPr>
           <w:rFonts w:ascii="Times New Roman" w:hAnsi="Times New Roman" w:cs="Times New Roman"/>
@@ -2706,7 +2706,7 @@
           <w:sz w:val="28"/>
         </w:rPr>
       </w:pPr>
-      <w:bookmarkStart w:id="9" w:name="_Toc238909026"/>
+      <w:bookmarkStart w:id="9" w:name="_Toc238910077"/>
       <w:r>
         <w:rPr>
           <w:rFonts w:ascii="Times New Roman" w:hAnsi="Times New Roman" w:cs="Times New Roman"/>
@@ -2928,7 +2928,7 @@
           <w:sz w:val="28"/>
         </w:rPr>
       </w:pPr>
-      <w:bookmarkStart w:id="10" w:name="_Toc238909027"/>
+      <w:bookmarkStart w:id="10" w:name="_Toc238910078"/>
       <w:r>
         <w:rPr>
           <w:rFonts w:ascii="Times New Roman" w:hAnsi="Times New Roman" w:cs="Times New Roman"/>
@@ -2993,7 +2993,7 @@
           <w:sz w:val="28"/>
         </w:rPr>
       </w:pPr>
-      <w:bookmarkStart w:id="11" w:name="_Toc238909028"/>
+      <w:bookmarkStart w:id="11" w:name="_Toc238910079"/>
       <w:r>
         <w:rPr>
           <w:rFonts w:ascii="Times New Roman" w:hAnsi="Times New Roman" w:cs="Times New Roman"/>
@@ -3071,6 +3071,26 @@
     </w:p>
     <w:p>
       <w:pPr>
+        <w:rPr>
+          <w:rFonts w:ascii="Times New Roman" w:eastAsiaTheme="majorEastAsia" w:hAnsi="Times New Roman" w:cs="Times New Roman"/>
+          <w:b/>
+          <w:bCs/>
+          <w:sz w:val="36"/>
+          <w:szCs w:val="32"/>
+        </w:rPr>
+      </w:pPr>
+      <w:r>
+        <w:rPr>
+          <w:rFonts w:ascii="Times New Roman" w:hAnsi="Times New Roman" w:cs="Times New Roman"/>
+          <w:b/>
+          <w:bCs/>
+          <w:sz w:val="36"/>
+        </w:rPr>
+        <w:br w:type="page"/>
+      </w:r>
+    </w:p>
+    <w:p>
+      <w:pPr>
         <w:pStyle w:val="Heading1"/>
         <w:jc w:val="both"/>
         <w:rPr>
@@ -3080,7 +3100,7 @@
           <w:color w:val="auto"/>
         </w:rPr>
       </w:pPr>
-      <w:bookmarkStart w:id="12" w:name="_Toc238909029"/>
+      <w:bookmarkStart w:id="12" w:name="_Toc238910080"/>
       <w:r>
         <w:rPr>
           <w:rFonts w:ascii="Times New Roman" w:hAnsi="Times New Roman" w:cs="Times New Roman"/>
@@ -3089,6 +3109,7 @@
           <w:color w:val="auto"/>
           <w:sz w:val="36"/>
         </w:rPr>
+        <w:lastRenderedPageBreak/>
         <w:t xml:space="preserve">PHẦN 2: </w:t>
       </w:r>
       <w:r>
@@ -3123,7 +3144,7 @@
           <w:sz w:val="28"/>
         </w:rPr>
       </w:pPr>
-      <w:bookmarkStart w:id="13" w:name="_Toc238909030"/>
+      <w:bookmarkStart w:id="13" w:name="_Toc238910081"/>
       <w:r>
         <w:rPr>
           <w:rFonts w:ascii="Times New Roman" w:hAnsi="Times New Roman" w:cs="Times New Roman"/>
@@ -3361,7 +3382,6 @@
           <w:sz w:val="22"/>
           <w:lang w:val="en-VN"/>
         </w:rPr>
-        <w:lastRenderedPageBreak/>
         <w:t>Lập kế hoạch nhiệm vụ và chuyển động (Task and Motion Planning):</w:t>
       </w:r>
       <w:r>
@@ -3614,7 +3634,7 @@
           <w:sz w:val="28"/>
         </w:rPr>
       </w:pPr>
-      <w:bookmarkStart w:id="14" w:name="_Toc238909031"/>
+      <w:bookmarkStart w:id="14" w:name="_Toc238910082"/>
       <w:r>
         <w:rPr>
           <w:rFonts w:ascii="Times New Roman" w:hAnsi="Times New Roman" w:cs="Times New Roman"/>
@@ -3942,6 +3962,7 @@
           <w:sz w:val="22"/>
           <w:szCs w:val="22"/>
         </w:rPr>
+        <w:lastRenderedPageBreak/>
         <w:t>Thực trạng:</w:t>
       </w:r>
       <w:r>
@@ -4159,6 +4180,27 @@
     </w:p>
     <w:p>
       <w:pPr>
+        <w:rPr>
+          <w:rFonts w:ascii="Times New Roman" w:eastAsiaTheme="majorEastAsia" w:hAnsi="Times New Roman" w:cs="Times New Roman"/>
+          <w:b/>
+          <w:bCs/>
+          <w:sz w:val="36"/>
+          <w:szCs w:val="32"/>
+        </w:rPr>
+      </w:pPr>
+      <w:bookmarkStart w:id="15" w:name="_Toc238910083"/>
+      <w:r>
+        <w:rPr>
+          <w:rFonts w:ascii="Times New Roman" w:hAnsi="Times New Roman" w:cs="Times New Roman"/>
+          <w:b/>
+          <w:bCs/>
+          <w:sz w:val="36"/>
+        </w:rPr>
+        <w:br w:type="page"/>
+      </w:r>
+    </w:p>
+    <w:p>
+      <w:pPr>
         <w:pStyle w:val="Heading1"/>
         <w:jc w:val="both"/>
         <w:rPr>
@@ -4168,7 +4210,6 @@
           <w:color w:val="auto"/>
         </w:rPr>
       </w:pPr>
-      <w:bookmarkStart w:id="15" w:name="_Toc238909032"/>
       <w:r>
         <w:rPr>
           <w:rFonts w:ascii="Times New Roman" w:hAnsi="Times New Roman" w:cs="Times New Roman"/>
@@ -4177,6 +4218,7 @@
           <w:color w:val="auto"/>
           <w:sz w:val="36"/>
         </w:rPr>
+        <w:lastRenderedPageBreak/>
         <w:t xml:space="preserve">PHẦN 3: </w:t>
       </w:r>
       <w:r>
@@ -4218,11 +4260,10 @@
           <w:noProof/>
           <w:sz w:val="24"/>
         </w:rPr>
-        <w:lastRenderedPageBreak/>
         <w:drawing>
-          <wp:inline distT="0" distB="0" distL="0" distR="0" wp14:anchorId="728102FC" wp14:editId="64F4DF62">
-            <wp:extent cx="6154366" cy="8324725"/>
-            <wp:effectExtent l="0" t="0" r="5715" b="0"/>
+          <wp:inline distT="0" distB="0" distL="0" distR="0" wp14:anchorId="728102FC" wp14:editId="0B315B7B">
+            <wp:extent cx="6153150" cy="7127132"/>
+            <wp:effectExtent l="0" t="0" r="0" b="0"/>
             <wp:docPr id="363782300" name="Picture 1"/>
             <wp:cNvGraphicFramePr>
               <a:graphicFrameLocks xmlns:a="http://schemas.openxmlformats.org/drawingml/2006/main" noChangeAspect="1"/>
@@ -4249,7 +4290,7 @@
                   <pic:spPr>
                     <a:xfrm>
                       <a:off x="0" y="0"/>
-                      <a:ext cx="6223382" cy="8418079"/>
+                      <a:ext cx="6279818" cy="7273851"/>
                     </a:xfrm>
                     <a:prstGeom prst="rect">
                       <a:avLst/>

</xml_diff>